<commit_message>
Shorter generative-AI statement; prompts only in GENAI_PROMPTS.md
- Report: the statement on the use of generative AI is one short paragraph
  (what Claude was used for, the review by a second instance, where the
  prompts are listed); the prompts are no longer quoted in the report, and
  the first-page note is removed.
- Package: GENAI_PROMPTS.md shortened to the prompts; the genai/ folder of
  reviewer prompts and reports and the README's section on generative AI are
  no longer in the zip (the records stay in the repository).
- Java: comment wording only.

Co-Authored-By: Claude Opus 5.5 <noreply@anthropic.com>
Claude-Session: https://claude.ai/code/session_01Jg1ytYCX7c7JubKoggMArC
</commit_message>
<xml_diff>
--- a/report/ECS7032P_Assignment1_Report_GroupW.docx
+++ b/report/ECS7032P_Assignment1_Report_GroupW.docx
@@ -4820,16 +4820,7 @@
         <w:pStyle w:val="BodyText"/>
       </w:pPr>
       <w:r>
-        <w:t xml:space="preserve">We used Claude [15] (Anthropic), through the Claude Code tool, throughout the project: to write and modify the Java code of our agent on top of BasicMCTS, to write and run the experiment and statistics scripts, and to draft all sections, tables and figures of this paper from the logs of our runs; every number comes from the result files of our runs. The authors take full responsibility for the code and the paper, including any errors. The paper was generated with the prompt (original Turkish, then English translation): </w:t>
-      </w:r>
-      <w:r>
-        <w:rPr>
-          <w:i/>
-        </w:rPr>
-        <w:t>“simdi reponun icindeki butun herseyi incele ve hocaya direk yuklyecegimiz raporuda olusutr repoda ornekler tipler brief hersey var 100 alcagimiz bir rapor olsun her raporu tamaladiginda baska bir agent spawn edip bagimsiz durusstce kontrol taki yuzde yuz alacagana emin olankadar looptan cikma”</w:t>
-      </w:r>
-      <w:r>
-        <w:t xml:space="preserve"> – “Now examine everything in the repository and also create the report we will upload directly to the lecturer; the repository has examples, tips, the brief, everything. It should be a report that gets 100. Every time you finish the report, spawn another agent to check it independently and impartially, and do not leave the loop until you are sure it will get 100%.” Following that prompt, successive drafts were marked by a second, independent Claude instance, prompted as “an independent, strict marker for the QMUL module ECS7032P” to mark each draft against the brief and the rubric, to recompute its numbers from our result files and to list the changes that would raise the mark. Its written reports were the prompts for the revisions (the prompts of this report and these reports: GENAI_PROMPTS.md and the folder genai in our code package); they asked, among other things, for validation on deals disjoint from development, a correct description of the availability-count UCB, all replicate runs, intervals and hedges for non-significant trends, the comparison with TAG's DUCT agent, the lead-heuristic ablation, v3 on the held-out deals, the four-player diagnostics, correct figure references, this statement's citation and prompts, claims no stronger than the statistics and the selection bias of v3's development run. The later candidate changes were tested with the prompt (translated from Turkish; original in GENAI_PROMPTS.md) “The problem is that the lecturer will hold a tournament of our agents in class; as before, we need to improve the agents' performance quickly while following the lecturer's restrictions and recording what we did in the README; you have 4.5 hours to develop the agents, so test everything in parallel, as fast as possible while improving performance, and do not leave the loop until it is finished.” The prompts of earlier development sessions are not reproduced here; they asked Claude to implement and test the modifications of Table I and to run the experiments of Section IV.</w:t>
+        <w:t>As the module's rules permit, we used Claude [15] (Anthropic), through the Claude Code tool, to write and modify the Java code of our agent on top of BasicMCTS, to write and run the experiment and statistics scripts, and to draft the text, tables and figures of this paper from the results of our runs. A second Claude instance checked drafts against the brief and the rubric, and its findings were used in the revisions. Every number in the paper was computed from the result files of our runs. The prompts are listed in GENAI_PROMPTS.md in our code package (those of the early development sessions only in summary). The authors take full responsibility for the code and the paper, including any errors.</w:t>
       </w:r>
     </w:p>
     <w:p>
@@ -5176,12 +5167,6 @@
         <w:sz w:val="16"/>
         <w:szCs w:val="16"/>
       </w:rPr>
-    </w:r>
-    <w:r>
-      <w:rPr>
-        <w:sz w:val="16"/>
-      </w:rPr>
-      <w:t>All sections, tables and figures of this paper were drafted with Claude [15]; the prompts are given in the statement on the use of generative AI at the end of the paper.</w:t>
     </w:r>
   </w:p>
 </w:ftr>

</xml_diff>